<commit_message>
Docs: cover multi-stem import + Rip, bump to v4.6
Updates TEST-PLAN.md, USER-MANUAL.md/.docx, FIRST-SESSION-CHECKLIST.html,
and README.md for the two features added in v4.6 (stem-pack ZIP import,
Rip system audio). No version-comparison language — each doc just
describes current behavior.

Co-Authored-By: Claude Sonnet 5 <noreply@anthropic.com>
</commit_message>
<xml_diff>
--- a/USER-MANUAL.docx
+++ b/USER-MANUAL.docx
@@ -2,7 +2,7 @@
 <file path=word/document.xml><?xml version="1.0" encoding="utf-8"?>
 <w:document xmlns:w="http://schemas.openxmlformats.org/wordprocessingml/2006/main" xmlns:m="http://schemas.openxmlformats.org/officeDocument/2006/math" xmlns:r="http://schemas.openxmlformats.org/officeDocument/2006/relationships" xmlns:o="urn:schemas-microsoft-com:office:office" xmlns:v="urn:schemas-microsoft-com:vml" xmlns:w10="urn:schemas-microsoft-com:office:word" xmlns:a="http://schemas.openxmlformats.org/drawingml/2006/main" xmlns:pic="http://schemas.openxmlformats.org/drawingml/2006/picture" xmlns:wp="http://schemas.openxmlformats.org/drawingml/2006/wordprocessingDrawing">
   <w:body>
-    <w:bookmarkStart w:id="47" w:name="orpheus-guitar-studio-user-manual"/>
+    <w:bookmarkStart w:id="50" w:name="orpheus-guitar-studio-user-manual"/>
     <w:p>
       <w:pPr>
         <w:pStyle w:val="Heading1"/>
@@ -456,7 +456,7 @@
       </w:r>
     </w:p>
     <w:bookmarkEnd w:id="13"/>
-    <w:bookmarkStart w:id="16" w:name="library-importing-songs"/>
+    <w:bookmarkStart w:id="19" w:name="library-importing-songs"/>
     <w:p>
       <w:pPr>
         <w:pStyle w:val="Heading2"/>
@@ -708,13 +708,13 @@
         <w:t xml:space="preserve">— nothing is ever silently thrown away.</w:t>
       </w:r>
     </w:p>
-    <w:bookmarkStart w:id="14" w:name="playlists-setlists"/>
+    <w:bookmarkStart w:id="14" w:name="importing-a-stem-pack-.zip"/>
     <w:p>
       <w:pPr>
         <w:pStyle w:val="Heading3"/>
       </w:pPr>
       <w:r>
-        <w:t xml:space="preserve">3.1 Playlists / setlists</w:t>
+        <w:t xml:space="preserve">3.1 Importing a stem pack (.zip)</w:t>
       </w:r>
     </w:p>
     <w:p>
@@ -722,6 +722,356 @@
         <w:pStyle w:val="FirstParagraph"/>
       </w:pPr>
       <w:r>
+        <w:t xml:space="preserve">Already have a song split into its parts — a purchased</w:t>
+      </w:r>
+      <w:r>
+        <w:t xml:space="preserve"> </w:t>
+      </w:r>
+      <w:r>
+        <w:t xml:space="preserve">“custom backing</w:t>
+      </w:r>
+      <w:r>
+        <w:t xml:space="preserve"> </w:t>
+      </w:r>
+      <w:r>
+        <w:t xml:space="preserve">track”</w:t>
+      </w:r>
+      <w:r>
+        <w:t xml:space="preserve"> </w:t>
+      </w:r>
+      <w:r>
+        <w:t xml:space="preserve">pack, a friend’s multitrack export, anything pre-split? Skip</w:t>
+      </w:r>
+      <w:r>
+        <w:t xml:space="preserve"> </w:t>
+      </w:r>
+      <w:r>
+        <w:t xml:space="preserve">separation entirely: click</w:t>
+      </w:r>
+      <w:r>
+        <w:t xml:space="preserve"> </w:t>
+      </w:r>
+      <w:r>
+        <w:rPr>
+          <w:b/>
+          <w:bCs/>
+        </w:rPr>
+        <w:t xml:space="preserve">or import a stem pack (.zip)</w:t>
+      </w:r>
+      <w:r>
+        <w:t xml:space="preserve">, just below</w:t>
+      </w:r>
+      <w:r>
+        <w:t xml:space="preserve"> </w:t>
+      </w:r>
+      <w:r>
+        <w:t xml:space="preserve">the normal drop zone (or drag the</w:t>
+      </w:r>
+      <w:r>
+        <w:t xml:space="preserve"> </w:t>
+      </w:r>
+      <w:r>
+        <w:rPr>
+          <w:rStyle w:val="VerbatimChar"/>
+        </w:rPr>
+        <w:t xml:space="preserve">.zip</w:t>
+      </w:r>
+      <w:r>
+        <w:t xml:space="preserve"> </w:t>
+      </w:r>
+      <w:r>
+        <w:t xml:space="preserve">straight onto the sidebar — it’s</w:t>
+      </w:r>
+      <w:r>
+        <w:t xml:space="preserve"> </w:t>
+      </w:r>
+      <w:r>
+        <w:t xml:space="preserve">detected automatically and routed here, not treated as a broken audio</w:t>
+      </w:r>
+      <w:r>
+        <w:t xml:space="preserve"> </w:t>
+      </w:r>
+      <w:r>
+        <w:t xml:space="preserve">file). Every audio file inside becomes its own stem lane, named exactly</w:t>
+      </w:r>
+      <w:r>
+        <w:t xml:space="preserve"> </w:t>
+      </w:r>
+      <w:r>
+        <w:t xml:space="preserve">as the file was — long names wrap in the lane header rather than getting</w:t>
+      </w:r>
+      <w:r>
+        <w:t xml:space="preserve"> </w:t>
+      </w:r>
+      <w:r>
+        <w:t xml:space="preserve">cut off, and nothing is renamed or</w:t>
+      </w:r>
+      <w:r>
+        <w:t xml:space="preserve"> </w:t>
+      </w:r>
+      <w:r>
+        <w:t xml:space="preserve">“prettified.”</w:t>
+      </w:r>
+      <w:r>
+        <w:t xml:space="preserve"> </w:t>
+      </w:r>
+      <w:r>
+        <w:t xml:space="preserve">The track appears in</w:t>
+      </w:r>
+      <w:r>
+        <w:t xml:space="preserve"> </w:t>
+      </w:r>
+      <w:r>
+        <w:t xml:space="preserve">your Library immediately, with its own autosaved project and practice</w:t>
+      </w:r>
+      <w:r>
+        <w:t xml:space="preserve"> </w:t>
+      </w:r>
+      <w:r>
+        <w:t xml:space="preserve">log entry, exactly like any other song. Each stem is converted to WAV on</w:t>
+      </w:r>
+      <w:r>
+        <w:t xml:space="preserve"> </w:t>
+      </w:r>
+      <w:r>
+        <w:t xml:space="preserve">import (so it works with the rest of the app the same way a separated</w:t>
+      </w:r>
+      <w:r>
+        <w:t xml:space="preserve"> </w:t>
+      </w:r>
+      <w:r>
+        <w:t xml:space="preserve">stem does) but never run through separation — that’s the whole point.</w:t>
+      </w:r>
+      <w:r>
+        <w:t xml:space="preserve"> </w:t>
+      </w:r>
+      <w:r>
+        <w:t xml:space="preserve">BPM, beat grid, chord lane, and key detection all still work on an</w:t>
+      </w:r>
+      <w:r>
+        <w:t xml:space="preserve"> </w:t>
+      </w:r>
+      <w:r>
+        <w:t xml:space="preserve">imported pack, matching stems by name (anything that looks like a</w:t>
+      </w:r>
+      <w:r>
+        <w:t xml:space="preserve"> </w:t>
+      </w:r>
+      <w:r>
+        <w:t xml:space="preserve">guitar/bass/piano/drum part) rather than needing the fixed stem names a</w:t>
+      </w:r>
+      <w:r>
+        <w:t xml:space="preserve"> </w:t>
+      </w:r>
+      <w:r>
+        <w:t xml:space="preserve">separation model produces. If two files in the zip would collide to the</w:t>
+      </w:r>
+      <w:r>
+        <w:t xml:space="preserve"> </w:t>
+      </w:r>
+      <w:r>
+        <w:t xml:space="preserve">same stem name, the import fails up front with a clear message naming</w:t>
+      </w:r>
+      <w:r>
+        <w:t xml:space="preserve"> </w:t>
+      </w:r>
+      <w:r>
+        <w:t xml:space="preserve">both, rather than silently overwriting one.</w:t>
+      </w:r>
+    </w:p>
+    <w:bookmarkEnd w:id="14"/>
+    <w:bookmarkStart w:id="16" w:name="Xbf20f9a849e97645d12e43a9cb697881cb854bb"/>
+    <w:p>
+      <w:pPr>
+        <w:pStyle w:val="Heading3"/>
+      </w:pPr>
+      <w:r>
+        <w:t xml:space="preserve">3.2 Rip — capture whatever’s playing on your Mac</w:t>
+      </w:r>
+    </w:p>
+    <w:p>
+      <w:pPr>
+        <w:pStyle w:val="FirstParagraph"/>
+      </w:pPr>
+      <w:r>
+        <w:t xml:space="preserve">Don’t have the file at all — just something playing in a browser tab,</w:t>
+      </w:r>
+      <w:r>
+        <w:t xml:space="preserve"> </w:t>
+      </w:r>
+      <w:r>
+        <w:t xml:space="preserve">another app, anywhere on your Mac? The</w:t>
+      </w:r>
+      <w:r>
+        <w:t xml:space="preserve"> </w:t>
+      </w:r>
+      <w:r>
+        <w:rPr>
+          <w:b/>
+          <w:bCs/>
+        </w:rPr>
+        <w:t xml:space="preserve">Rip system audio</w:t>
+      </w:r>
+      <w:r>
+        <w:t xml:space="preserve"> </w:t>
+      </w:r>
+      <w:r>
+        <w:t xml:space="preserve">card in the</w:t>
+      </w:r>
+      <w:r>
+        <w:t xml:space="preserve"> </w:t>
+      </w:r>
+      <w:r>
+        <w:t xml:space="preserve">sidebar captures it straight into your Library as a new song. This needs</w:t>
+      </w:r>
+      <w:r>
+        <w:t xml:space="preserve"> </w:t>
+      </w:r>
+      <w:r>
+        <w:t xml:space="preserve">a one-time install of a free, open-source virtual audio driver,</w:t>
+      </w:r>
+      <w:r>
+        <w:t xml:space="preserve"> </w:t>
+      </w:r>
+      <w:hyperlink r:id="rId15">
+        <w:r>
+          <w:rPr>
+            <w:rStyle w:val="Hyperlink"/>
+          </w:rPr>
+          <w:t xml:space="preserve">BlackHole</w:t>
+        </w:r>
+      </w:hyperlink>
+      <w:r>
+        <w:t xml:space="preserve"> </w:t>
+      </w:r>
+      <w:r>
+        <w:t xml:space="preserve">(</w:t>
+      </w:r>
+      <w:r>
+        <w:rPr>
+          <w:rStyle w:val="VerbatimChar"/>
+        </w:rPr>
+        <w:t xml:space="preserve">brew install blackhole-2ch</w:t>
+      </w:r>
+      <w:r>
+        <w:t xml:space="preserve">), set as your Mac’s audio output — the</w:t>
+      </w:r>
+      <w:r>
+        <w:t xml:space="preserve"> </w:t>
+      </w:r>
+      <w:r>
+        <w:t xml:space="preserve">panel shows this instruction automatically if no BlackHole device is</w:t>
+      </w:r>
+      <w:r>
+        <w:t xml:space="preserve"> </w:t>
+      </w:r>
+      <w:r>
+        <w:t xml:space="preserve">found yet. Once it’s installed, pick it in the device dropdown, click</w:t>
+      </w:r>
+      <w:r>
+        <w:t xml:space="preserve"> </w:t>
+      </w:r>
+      <w:r>
+        <w:rPr>
+          <w:b/>
+          <w:bCs/>
+        </w:rPr>
+        <w:t xml:space="preserve">● Start Rip</w:t>
+      </w:r>
+      <w:r>
+        <w:t xml:space="preserve">, and the elapsed time counts up while it records; click</w:t>
+      </w:r>
+      <w:r>
+        <w:t xml:space="preserve"> </w:t>
+      </w:r>
+      <w:r>
+        <w:rPr>
+          <w:b/>
+          <w:bCs/>
+        </w:rPr>
+        <w:t xml:space="preserve">■ Stop Rip</w:t>
+      </w:r>
+      <w:r>
+        <w:t xml:space="preserve">, give the take a name, and it appears in your Library like</w:t>
+      </w:r>
+      <w:r>
+        <w:t xml:space="preserve"> </w:t>
+      </w:r>
+      <w:r>
+        <w:t xml:space="preserve">any other imported song. One thing worth knowing up front: routing</w:t>
+      </w:r>
+      <w:r>
+        <w:t xml:space="preserve"> </w:t>
+      </w:r>
+      <w:r>
+        <w:t xml:space="preserve">straight to BlackHole means</w:t>
+      </w:r>
+      <w:r>
+        <w:t xml:space="preserve"> </w:t>
+      </w:r>
+      <w:r>
+        <w:rPr>
+          <w:i/>
+          <w:iCs/>
+        </w:rPr>
+        <w:t xml:space="preserve">you</w:t>
+      </w:r>
+      <w:r>
+        <w:t xml:space="preserve"> </w:t>
+      </w:r>
+      <w:r>
+        <w:t xml:space="preserve">hear silence while ripping (the audio</w:t>
+      </w:r>
+      <w:r>
+        <w:t xml:space="preserve"> </w:t>
+      </w:r>
+      <w:r>
+        <w:t xml:space="preserve">is going to the capture device, not your speakers) — build a</w:t>
+      </w:r>
+      <w:r>
+        <w:t xml:space="preserve"> </w:t>
+      </w:r>
+      <w:r>
+        <w:rPr>
+          <w:b/>
+          <w:bCs/>
+        </w:rPr>
+        <w:t xml:space="preserve">Multi-Output Device</w:t>
+      </w:r>
+      <w:r>
+        <w:t xml:space="preserve"> </w:t>
+      </w:r>
+      <w:r>
+        <w:t xml:space="preserve">in Audio MIDI Setup (combining BlackHole with</w:t>
+      </w:r>
+      <w:r>
+        <w:t xml:space="preserve"> </w:t>
+      </w:r>
+      <w:r>
+        <w:t xml:space="preserve">your normal output) if you want to hear it too while it records; the</w:t>
+      </w:r>
+      <w:r>
+        <w:t xml:space="preserve"> </w:t>
+      </w:r>
+      <w:r>
+        <w:t xml:space="preserve">panel’s own hint says so.</w:t>
+      </w:r>
+    </w:p>
+    <w:bookmarkEnd w:id="16"/>
+    <w:bookmarkStart w:id="17" w:name="playlists-setlists"/>
+    <w:p>
+      <w:pPr>
+        <w:pStyle w:val="Heading3"/>
+      </w:pPr>
+      <w:r>
+        <w:t xml:space="preserve">3.3 Playlists / setlists</w:t>
+      </w:r>
+    </w:p>
+    <w:p>
+      <w:pPr>
+        <w:pStyle w:val="FirstParagraph"/>
+      </w:pPr>
+      <w:r>
         <w:t xml:space="preserve">The</w:t>
       </w:r>
       <w:r>
@@ -948,14 +1298,14 @@
         <w:t xml:space="preserve">a copy of a song’s mix/rig settings.</w:t>
       </w:r>
     </w:p>
-    <w:bookmarkEnd w:id="14"/>
-    <w:bookmarkStart w:id="15" w:name="practice-log"/>
+    <w:bookmarkEnd w:id="17"/>
+    <w:bookmarkStart w:id="18" w:name="practice-log"/>
     <w:p>
       <w:pPr>
         <w:pStyle w:val="Heading3"/>
       </w:pPr>
       <w:r>
-        <w:t xml:space="preserve">3.2 Practice log</w:t>
+        <w:t xml:space="preserve">3.4 Practice log</w:t>
       </w:r>
     </w:p>
     <w:p>
@@ -1026,9 +1376,9 @@
         <w:t xml:space="preserve">number.</w:t>
       </w:r>
     </w:p>
-    <w:bookmarkEnd w:id="15"/>
-    <w:bookmarkEnd w:id="16"/>
-    <w:bookmarkStart w:id="17" w:name="separating-into-stems"/>
+    <w:bookmarkEnd w:id="18"/>
+    <w:bookmarkEnd w:id="19"/>
+    <w:bookmarkStart w:id="20" w:name="separating-into-stems"/>
     <w:p>
       <w:pPr>
         <w:pStyle w:val="Heading2"/>
@@ -1040,6 +1390,38 @@
     <w:p>
       <w:pPr>
         <w:pStyle w:val="FirstParagraph"/>
+      </w:pPr>
+      <w:r>
+        <w:t xml:space="preserve">A track imported as a stem pack (§3.1) skips this section entirely —</w:t>
+      </w:r>
+      <w:r>
+        <w:t xml:space="preserve"> </w:t>
+      </w:r>
+      <w:r>
+        <w:t xml:space="preserve">its model badge just reads</w:t>
+      </w:r>
+      <w:r>
+        <w:t xml:space="preserve"> </w:t>
+      </w:r>
+      <w:r>
+        <w:rPr>
+          <w:rStyle w:val="VerbatimChar"/>
+        </w:rPr>
+        <w:t xml:space="preserve">imported</w:t>
+      </w:r>
+      <w:r>
+        <w:t xml:space="preserve">, and the mixer is ready the moment</w:t>
+      </w:r>
+      <w:r>
+        <w:t xml:space="preserve"> </w:t>
+      </w:r>
+      <w:r>
+        <w:t xml:space="preserve">you select it. Everything below is for a normal single-file import.</w:t>
+      </w:r>
+    </w:p>
+    <w:p>
+      <w:pPr>
+        <w:pStyle w:val="BodyText"/>
       </w:pPr>
       <w:r>
         <w:t xml:space="preserve">Pick a model, then</w:t>
@@ -1441,8 +1823,8 @@
         <w:t xml:space="preserve">separation engine’s quality ceiling, not a bug in your mix.</w:t>
       </w:r>
     </w:p>
-    <w:bookmarkEnd w:id="17"/>
-    <w:bookmarkStart w:id="18" w:name="the-mixer"/>
+    <w:bookmarkEnd w:id="20"/>
+    <w:bookmarkStart w:id="21" w:name="the-mixer"/>
     <w:p>
       <w:pPr>
         <w:pStyle w:val="Heading2"/>
@@ -2197,8 +2579,8 @@
         <w:t xml:space="preserve">listening level, not something that belongs to any one song.</w:t>
       </w:r>
     </w:p>
-    <w:bookmarkEnd w:id="18"/>
-    <w:bookmarkStart w:id="19" w:name="timeline-mode-looping"/>
+    <w:bookmarkEnd w:id="21"/>
+    <w:bookmarkStart w:id="22" w:name="timeline-mode-looping"/>
     <w:p>
       <w:pPr>
         <w:pStyle w:val="Heading2"/>
@@ -2940,8 +3322,8 @@
         <w:t xml:space="preserve">pass at a time.</w:t>
       </w:r>
     </w:p>
-    <w:bookmarkEnd w:id="19"/>
-    <w:bookmarkStart w:id="20" w:name="guitar-split-experimental"/>
+    <w:bookmarkEnd w:id="22"/>
+    <w:bookmarkStart w:id="23" w:name="guitar-split-experimental"/>
     <w:p>
       <w:pPr>
         <w:pStyle w:val="Heading2"/>
@@ -3258,8 +3640,8 @@
         <w:t xml:space="preserve">try more than one and judge by ear, same as always.</w:t>
       </w:r>
     </w:p>
-    <w:bookmarkEnd w:id="20"/>
-    <w:bookmarkStart w:id="21" w:name="export"/>
+    <w:bookmarkEnd w:id="23"/>
+    <w:bookmarkStart w:id="24" w:name="export"/>
     <w:p>
       <w:pPr>
         <w:pStyle w:val="Heading2"/>
@@ -3514,8 +3896,8 @@
         <w:t xml:space="preserve">shortcut straight to it.</w:t>
       </w:r>
     </w:p>
-    <w:bookmarkEnd w:id="21"/>
-    <w:bookmarkStart w:id="35" w:name="tone-lab-play-along"/>
+    <w:bookmarkEnd w:id="24"/>
+    <w:bookmarkStart w:id="38" w:name="tone-lab-play-along"/>
     <w:p>
       <w:pPr>
         <w:pStyle w:val="Heading2"/>
@@ -3738,7 +4120,7 @@
         <w:t xml:space="preserve">Lab traces the signal-chain order live as you drag cards around.</w:t>
       </w:r>
     </w:p>
-    <w:bookmarkStart w:id="22" w:name="backing-track-play-along-top-strip"/>
+    <w:bookmarkStart w:id="25" w:name="backing-track-play-along-top-strip"/>
     <w:p>
       <w:pPr>
         <w:pStyle w:val="Heading3"/>
@@ -3773,8 +4155,8 @@
         <w:t xml:space="preserve">exact same state as the main transport; adjusting either one updates both.</w:t>
       </w:r>
     </w:p>
-    <w:bookmarkEnd w:id="22"/>
-    <w:bookmarkStart w:id="23" w:name="input-tone-lab-top-strip"/>
+    <w:bookmarkEnd w:id="25"/>
+    <w:bookmarkStart w:id="26" w:name="input-tone-lab-top-strip"/>
     <w:p>
       <w:pPr>
         <w:pStyle w:val="Heading3"/>
@@ -3988,8 +4370,8 @@
         <w:t xml:space="preserve">clipping.</w:t>
       </w:r>
     </w:p>
-    <w:bookmarkEnd w:id="23"/>
-    <w:bookmarkStart w:id="24" w:name="tuner-play-along-top-strip"/>
+    <w:bookmarkEnd w:id="26"/>
+    <w:bookmarkStart w:id="27" w:name="tuner-play-along-top-strip"/>
     <w:p>
       <w:pPr>
         <w:pStyle w:val="Heading3"/>
@@ -4088,8 +4470,8 @@
         <w:t xml:space="preserve">won’t read cleanly.</w:t>
       </w:r>
     </w:p>
-    <w:bookmarkEnd w:id="24"/>
-    <w:bookmarkStart w:id="25" w:name="amp-three-modes-tone-lab"/>
+    <w:bookmarkEnd w:id="27"/>
+    <w:bookmarkStart w:id="28" w:name="amp-three-modes-tone-lab"/>
     <w:p>
       <w:pPr>
         <w:pStyle w:val="Heading3"/>
@@ -4197,8 +4579,8 @@
         <w:t xml:space="preserve">controls, and §9.9 for a note on which captures can and can’t run live.</w:t>
       </w:r>
     </w:p>
-    <w:bookmarkEnd w:id="25"/>
-    <w:bookmarkStart w:id="26" w:name="a-the-nam-tweaker"/>
+    <w:bookmarkEnd w:id="28"/>
+    <w:bookmarkStart w:id="29" w:name="a-the-nam-tweaker"/>
     <w:p>
       <w:pPr>
         <w:pStyle w:val="Heading3"/>
@@ -4550,8 +4932,8 @@
         <w:t xml:space="preserve">failure or silently misreading the weights.</w:t>
       </w:r>
     </w:p>
-    <w:bookmarkEnd w:id="26"/>
-    <w:bookmarkStart w:id="27" w:name="Xab1235d41628a97792d6f00f8cb81dcc2bfb52f"/>
+    <w:bookmarkEnd w:id="29"/>
+    <w:bookmarkStart w:id="30" w:name="Xab1235d41628a97792d6f00f8cb81dcc2bfb52f"/>
     <w:p>
       <w:pPr>
         <w:pStyle w:val="Heading3"/>
@@ -4700,8 +5082,8 @@
         <w:t xml:space="preserve">both dropdowns always show the same selection.</w:t>
       </w:r>
     </w:p>
-    <w:bookmarkEnd w:id="27"/>
-    <w:bookmarkStart w:id="28" w:name="cab-ir-tone-lab"/>
+    <w:bookmarkEnd w:id="30"/>
+    <w:bookmarkStart w:id="31" w:name="cab-ir-tone-lab"/>
     <w:p>
       <w:pPr>
         <w:pStyle w:val="Heading3"/>
@@ -4817,8 +5199,8 @@
         <w:t xml:space="preserve">losing your slider positions.</w:t>
       </w:r>
     </w:p>
-    <w:bookmarkEnd w:id="28"/>
-    <w:bookmarkStart w:id="29" w:name="Xee8bbaba3bb7fc9347cccc6860e1532c7c8cd89"/>
+    <w:bookmarkEnd w:id="31"/>
+    <w:bookmarkStart w:id="32" w:name="Xee8bbaba3bb7fc9347cccc6860e1532c7c8cd89"/>
     <w:p>
       <w:pPr>
         <w:pStyle w:val="Heading3"/>
@@ -5228,8 +5610,8 @@
         <w:t xml:space="preserve">has no effect on the actual audio routing.</w:t>
       </w:r>
     </w:p>
-    <w:bookmarkEnd w:id="29"/>
-    <w:bookmarkStart w:id="31" w:name="adding-amp-models-cab-irs-tone-lab"/>
+    <w:bookmarkEnd w:id="32"/>
+    <w:bookmarkStart w:id="34" w:name="adding-amp-models-cab-irs-tone-lab"/>
     <w:p>
       <w:pPr>
         <w:pStyle w:val="Heading3"/>
@@ -5356,7 +5738,7 @@
       <w:r>
         <w:t xml:space="preserve"> </w:t>
       </w:r>
-      <w:hyperlink r:id="rId30">
+      <w:hyperlink r:id="rId33">
         <w:r>
           <w:rPr>
             <w:rStyle w:val="Hyperlink"/>
@@ -5392,8 +5774,8 @@
         <w:t xml:space="preserve">captures if you want more.</w:t>
       </w:r>
     </w:p>
-    <w:bookmarkEnd w:id="31"/>
-    <w:bookmarkStart w:id="32" w:name="suggest-a-tone-tone-lab"/>
+    <w:bookmarkEnd w:id="34"/>
+    <w:bookmarkStart w:id="35" w:name="suggest-a-tone-tone-lab"/>
     <w:p>
       <w:pPr>
         <w:pStyle w:val="Heading3"/>
@@ -5512,8 +5894,8 @@
         <w:t xml:space="preserve">heavy to run live (§9.9).</w:t>
       </w:r>
     </w:p>
-    <w:bookmarkEnd w:id="32"/>
-    <w:bookmarkStart w:id="33" w:name="latency-tone-lab"/>
+    <w:bookmarkEnd w:id="35"/>
+    <w:bookmarkStart w:id="36" w:name="latency-tone-lab"/>
     <w:p>
       <w:pPr>
         <w:pStyle w:val="Heading3"/>
@@ -5578,8 +5960,8 @@
         <w:t xml:space="preserve">software.</w:t>
       </w:r>
     </w:p>
-    <w:bookmarkEnd w:id="33"/>
-    <w:bookmarkStart w:id="34" w:name="X95517be8d1a18ecafddf6a6c9523903dbc5275a"/>
+    <w:bookmarkEnd w:id="36"/>
+    <w:bookmarkStart w:id="37" w:name="X95517be8d1a18ecafddf6a6c9523903dbc5275a"/>
     <w:p>
       <w:pPr>
         <w:pStyle w:val="Heading3"/>
@@ -5741,9 +6123,9 @@
         <w:t xml:space="preserve">machine right now, not a bug to work around.</w:t>
       </w:r>
     </w:p>
-    <w:bookmarkEnd w:id="34"/>
-    <w:bookmarkEnd w:id="35"/>
-    <w:bookmarkStart w:id="41" w:name="recording-a-performance"/>
+    <w:bookmarkEnd w:id="37"/>
+    <w:bookmarkEnd w:id="38"/>
+    <w:bookmarkStart w:id="44" w:name="recording-a-performance"/>
     <w:p>
       <w:pPr>
         <w:pStyle w:val="Heading2"/>
@@ -6290,7 +6672,7 @@
         <w:t xml:space="preserve">capture of your speakers.</w:t>
       </w:r>
     </w:p>
-    <w:bookmarkStart w:id="36" w:name="riff-capture-save-that"/>
+    <w:bookmarkStart w:id="39" w:name="riff-capture-save-that"/>
     <w:p>
       <w:pPr>
         <w:pStyle w:val="Heading3"/>
@@ -6425,8 +6807,8 @@
         <w:t xml:space="preserve">it keeps going right after.</w:t>
       </w:r>
     </w:p>
-    <w:bookmarkEnd w:id="36"/>
-    <w:bookmarkStart w:id="37" w:name="av-sync-calibration"/>
+    <w:bookmarkEnd w:id="39"/>
+    <w:bookmarkStart w:id="40" w:name="av-sync-calibration"/>
     <w:p>
       <w:pPr>
         <w:pStyle w:val="Heading3"/>
@@ -6669,8 +7051,8 @@
         <w:t xml:space="preserve">across sessions.</w:t>
       </w:r>
     </w:p>
-    <w:bookmarkEnd w:id="37"/>
-    <w:bookmarkStart w:id="38" w:name="takes"/>
+    <w:bookmarkEnd w:id="40"/>
+    <w:bookmarkStart w:id="41" w:name="takes"/>
     <w:p>
       <w:pPr>
         <w:pStyle w:val="Heading3"/>
@@ -6882,8 +7264,8 @@
         <w:t xml:space="preserve">touched.</w:t>
       </w:r>
     </w:p>
-    <w:bookmarkEnd w:id="38"/>
-    <w:bookmarkStart w:id="39" w:name="practice-mode-auto-retake-on-loop"/>
+    <w:bookmarkEnd w:id="41"/>
+    <w:bookmarkStart w:id="42" w:name="practice-mode-auto-retake-on-loop"/>
     <w:p>
       <w:pPr>
         <w:pStyle w:val="Heading3"/>
@@ -7058,8 +7440,8 @@
         <w:t xml:space="preserve">way: play a few back, star the good ones, delete the rest.</w:t>
       </w:r>
     </w:p>
-    <w:bookmarkEnd w:id="39"/>
-    <w:bookmarkStart w:id="40" w:name="compare-two-takes-side-by-side"/>
+    <w:bookmarkEnd w:id="42"/>
+    <w:bookmarkStart w:id="43" w:name="compare-two-takes-side-by-side"/>
     <w:p>
       <w:pPr>
         <w:pStyle w:val="Heading3"/>
@@ -7158,9 +7540,9 @@
         <w:t xml:space="preserve">different third.</w:t>
       </w:r>
     </w:p>
-    <w:bookmarkEnd w:id="40"/>
-    <w:bookmarkEnd w:id="41"/>
-    <w:bookmarkStart w:id="42" w:name="projects-autosave"/>
+    <w:bookmarkEnd w:id="43"/>
+    <w:bookmarkEnd w:id="44"/>
+    <w:bookmarkStart w:id="45" w:name="projects-autosave"/>
     <w:p>
       <w:pPr>
         <w:pStyle w:val="Heading2"/>
@@ -7295,8 +7677,8 @@
         <w:t xml:space="preserve">doesn’t change the file’s bytes.</w:t>
       </w:r>
     </w:p>
-    <w:bookmarkEnd w:id="42"/>
-    <w:bookmarkStart w:id="43" w:name="keyboard-shortcuts"/>
+    <w:bookmarkEnd w:id="45"/>
+    <w:bookmarkStart w:id="46" w:name="keyboard-shortcuts"/>
     <w:p>
       <w:pPr>
         <w:pStyle w:val="Heading2"/>
@@ -7615,8 +7997,8 @@
         <w:t xml:space="preserve">Shortcuts don’t fire while a text field has focus.</w:t>
       </w:r>
     </w:p>
-    <w:bookmarkEnd w:id="43"/>
-    <w:bookmarkStart w:id="44" w:name="troubleshooting"/>
+    <w:bookmarkEnd w:id="46"/>
+    <w:bookmarkStart w:id="47" w:name="troubleshooting"/>
     <w:p>
       <w:pPr>
         <w:pStyle w:val="Heading2"/>
@@ -7964,8 +8346,8 @@
         </w:tc>
       </w:tr>
     </w:tbl>
-    <w:bookmarkEnd w:id="44"/>
-    <w:bookmarkStart w:id="45" w:name="X3e8c6eac452190b73a8cefc6b69e7df217c60fb"/>
+    <w:bookmarkEnd w:id="47"/>
+    <w:bookmarkStart w:id="48" w:name="X3e8c6eac452190b73a8cefc6b69e7df217c60fb"/>
     <w:p>
       <w:pPr>
         <w:pStyle w:val="Heading2"/>
@@ -8106,8 +8488,8 @@
         <w:t xml:space="preserve">detection, so the downbeat accent will be wrong in 3/4 or odd meters.</w:t>
       </w:r>
     </w:p>
-    <w:bookmarkEnd w:id="45"/>
-    <w:bookmarkStart w:id="46" w:name="file-locations-reference"/>
+    <w:bookmarkEnd w:id="48"/>
+    <w:bookmarkStart w:id="49" w:name="file-locations-reference"/>
     <w:p>
       <w:pPr>
         <w:pStyle w:val="Heading2"/>
@@ -8181,8 +8563,8 @@
         <w:t xml:space="preserve">GuitarStudio/projects/          autosaved per-song mix state</w:t>
       </w:r>
     </w:p>
-    <w:bookmarkEnd w:id="46"/>
-    <w:bookmarkEnd w:id="47"/>
+    <w:bookmarkEnd w:id="49"/>
+    <w:bookmarkEnd w:id="50"/>
     <w:sectPr>
       <w:footnotePr>
         <w:numRestart w:val="eachSect"/>

</xml_diff>

<commit_message>
Fix NAM A2 engine memory leak causing growing delay + silence on switch
Real-world TONE3000 A2 test pack (20 metal-band captures) reproduced the
reported bug: switching between several models eventually causes ~15s of
silence. Root cause: buildModelOfficial() created a new official-core
instance and malloc'd buffers on every load but never freed the previous
model's — no dispose call existed anywhere a model/calib reference was
dropped (normal swap, failed load, live-overrun rollback, or unload).

Verified against 8 of the user's actual files: without disposal, instance
count and wasm heap grow monotonically (1->8 instances, 64MB->116MB, 3
growth events); with the added disposeModel()/disposeCalib() calls at
every drop site, both stay flat.

Docs updated: research/nam-engine-review-spec.md §13, USER-MANUAL.md
caveat + troubleshooting row.

Co-Authored-By: Claude Sonnet 5 <noreply@anthropic.com>
Claude-Session: https://claude.ai/code/session_011dt3KPhL8fJMToEHU8Pi4m
</commit_message>
<xml_diff>
--- a/USER-MANUAL.docx
+++ b/USER-MANUAL.docx
@@ -19868,6 +19868,32 @@
               <w:jc w:val="left"/>
             </w:pPr>
             <w:r>
+              <w:t xml:space="preserve">Switching NAM captures repeatedly gets slower, then goes silent for several seconds</w:t>
+            </w:r>
+          </w:p>
+        </w:tc>
+        <w:tc>
+          <w:tcPr/>
+          <w:p>
+            <w:pPr>
+              <w:pStyle w:val="Compact"/>
+              <w:jc w:val="left"/>
+            </w:pPr>
+            <w:r>
+              <w:t xml:space="preserve">Fixed — was a memory leak in the A2/official-core engine where the previous model’s resources weren’t released on switch. If it recurs, report it with the capture name.</w:t>
+            </w:r>
+          </w:p>
+        </w:tc>
+      </w:tr>
+      <w:tr>
+        <w:tc>
+          <w:tcPr/>
+          <w:p>
+            <w:pPr>
+              <w:pStyle w:val="Compact"/>
+              <w:jc w:val="left"/>
+            </w:pPr>
+            <w:r>
               <w:t xml:space="preserve">An A2 capture sounds wrong or won’t load</w:t>
             </w:r>
           </w:p>
@@ -19880,20 +19906,7 @@
               <w:jc w:val="left"/>
             </w:pPr>
             <w:r>
-              <w:t xml:space="preserve">A2 support is verified against the NAM project’s own example models but</w:t>
-            </w:r>
-            <w:r>
-              <w:t xml:space="preserve"> </w:t>
-            </w:r>
-            <w:r>
-              <w:rPr>
-                <w:bCs/>
-                <w:b/>
-              </w:rPr>
-              <w:t xml:space="preserve">not yet against a real-world download</w:t>
-            </w:r>
-            <w:r>
-              <w:t xml:space="preserve">, so this is the most likely place for a genuine bug. Worth reporting with the capture name rather than assuming it’s your file.</w:t>
+              <w:t xml:space="preserve">A2 support is verified against both the NAM project’s example models and a real TONE3000 pack. Still worth reporting with the capture name if one misbehaves.</w:t>
             </w:r>
           </w:p>
         </w:tc>
@@ -20553,41 +20566,37 @@
         <w:pStyle w:val="Compact"/>
       </w:pPr>
       <w:r>
-        <w:t xml:space="preserve">A2 support has been verified against the official NAM project’s own</w:t>
-      </w:r>
-      <w:r>
-        <w:t xml:space="preserve"> </w:t>
-      </w:r>
-      <w:r>
-        <w:t xml:space="preserve">example models, but</w:t>
-      </w:r>
-      <w:r>
-        <w:t xml:space="preserve"> </w:t>
-      </w:r>
-      <w:r>
-        <w:rPr>
-          <w:bCs/>
-          <w:b/>
-        </w:rPr>
-        <w:t xml:space="preserve">not yet against a real-world A2 download</w:t>
-      </w:r>
-      <w:r>
-        <w:t xml:space="preserve"> </w:t>
-      </w:r>
-      <w:r>
-        <w:t xml:space="preserve">from a</w:t>
-      </w:r>
-      <w:r>
-        <w:t xml:space="preserve"> </w:t>
-      </w:r>
-      <w:r>
-        <w:t xml:space="preserve">capture-sharing site. If an A2 capture misbehaves, that’s worth</w:t>
-      </w:r>
-      <w:r>
-        <w:t xml:space="preserve"> </w:t>
-      </w:r>
-      <w:r>
-        <w:t xml:space="preserve">reporting rather than assuming it’s your file.</w:t>
+        <w:t xml:space="preserve">A2 support has been verified against both the official NAM project’s own</w:t>
+      </w:r>
+      <w:r>
+        <w:t xml:space="preserve"> </w:t>
+      </w:r>
+      <w:r>
+        <w:t xml:space="preserve">example models and a real 20-capture pack downloaded from TONE3000. That</w:t>
+      </w:r>
+      <w:r>
+        <w:t xml:space="preserve"> </w:t>
+      </w:r>
+      <w:r>
+        <w:t xml:space="preserve">testing caught a real bug — switching between several A2 captures could</w:t>
+      </w:r>
+      <w:r>
+        <w:t xml:space="preserve"> </w:t>
+      </w:r>
+      <w:r>
+        <w:t xml:space="preserve">leave the previous model’s memory unreleased, causing a growing delay and</w:t>
+      </w:r>
+      <w:r>
+        <w:t xml:space="preserve"> </w:t>
+      </w:r>
+      <w:r>
+        <w:t xml:space="preserve">eventually several seconds of silence on the next switch — which is now</w:t>
+      </w:r>
+      <w:r>
+        <w:t xml:space="preserve"> </w:t>
+      </w:r>
+      <w:r>
+        <w:t xml:space="preserve">fixed (each switch releases the outgoing model’s resources).</w:t>
       </w:r>
     </w:p>
     <w:p>

</xml_diff>

<commit_message>
AI Assistant: auto-save This song's Artist/Title once both are filled in
Both fields already got prefilled from an "Artist - Title" filename per
the earlier work, but the user still had to find and click Save to make
that guess (or a manual entry) actually usable by This Track/This
Artist/Ask AI. Now it saves itself, debounced 800ms after the last
keystroke, once artist and title both have something in them; a
filename-guess that already satisfies both saves immediately on open. The
Save button stays for an explicit re-save.

Verified headlessly: no save fires with only one field populated, no save
fires mid-keystroke, exactly one POST /api/trackinfo fires after the
debounce window with the correct payload, and the status line updates to
"Saved."

Co-Authored-By: Claude Sonnet 5 <noreply@anthropic.com>
Claude-Session: https://claude.ai/code/session_011dt3KPhL8fJMToEHU8Pi4m
</commit_message>
<xml_diff>
--- a/USER-MANUAL.docx
+++ b/USER-MANUAL.docx
@@ -16749,26 +16749,25 @@
         <w:t xml:space="preserve"> </w:t>
       </w:r>
       <w:r>
-        <w:t xml:space="preserve">from the filename; always check and edit it, then click</w:t>
-      </w:r>
-      <w:r>
-        <w:t xml:space="preserve"> </w:t>
-      </w:r>
-      <w:r>
-        <w:rPr>
-          <w:bCs/>
-          <w:b/>
-        </w:rPr>
-        <w:t xml:space="preserve">Save</w:t>
-      </w:r>
-      <w:r>
-        <w:t xml:space="preserve">. Stored</w:t>
-      </w:r>
-      <w:r>
-        <w:t xml:space="preserve"> </w:t>
-      </w:r>
-      <w:r>
-        <w:t xml:space="preserve">per-song, same as everything else about a song.</w:t>
+        <w:t xml:space="preserve">from the filename; always check and edit it. Once both fields have</w:t>
+      </w:r>
+      <w:r>
+        <w:t xml:space="preserve"> </w:t>
+      </w:r>
+      <w:r>
+        <w:t xml:space="preserve">something in them it saves itself — no need to hit Save (the button is</w:t>
+      </w:r>
+      <w:r>
+        <w:t xml:space="preserve"> </w:t>
+      </w:r>
+      <w:r>
+        <w:t xml:space="preserve">still there for an explicit re-save, e.g. after clearing a field back out).</w:t>
+      </w:r>
+      <w:r>
+        <w:t xml:space="preserve"> </w:t>
+      </w:r>
+      <w:r>
+        <w:t xml:space="preserve">Stored per-song, same as everything else about a song.</w:t>
       </w:r>
     </w:p>
     <w:p>

</xml_diff>

<commit_message>
Regenerate stale screenshots and add missing checklist sections
All 7 docs/screenshots were still showing the pre-V9 UI; replaced every
one with fresh captures against a synthetic demo track built purely for
this purpose (real audio, so BPM/key/chord detection is genuine, not
faked). Also fixed the Tone Lab screenshot's caption to match what it
actually shows (the pedalboard icon row + an open card), since the prior
crop cut off before reaching the pedalboard at all.

FIRST-SESSION-CHECKLIST.html was missing whole sections for two AI Lab
tabs (Rate My Take, AI Assistant) and the entire Tab View screen -
written and verified against the actual UI/source, not blind. Also
documented Tab View's "Generate tab from audio" and "Through my rig"
features in USER-MANUAL.md, which covered neither despite both being
real, working features.

USER-MANUAL.docx regenerated via pandoc to match.
</commit_message>
<xml_diff>
--- a/USER-MANUAL.docx
+++ b/USER-MANUAL.docx
@@ -104,7 +104,7 @@
       <w:r>
         <w:drawing>
           <wp:inline>
-            <wp:extent cx="3810000" cy="2540000"/>
+            <wp:extent cx="5334000" cy="3076513"/>
             <wp:effectExtent b="0" l="0" r="0" t="0"/>
             <wp:docPr descr="The Mixer, with a separated track loaded — stems, chord ribbon, click track, and the transport toolbar." title="" id="21" name="Picture"/>
             <a:graphic>
@@ -125,7 +125,7 @@
                   <pic:spPr bwMode="auto">
                     <a:xfrm>
                       <a:off x="0" y="0"/>
-                      <a:ext cx="3810000" cy="2540000"/>
+                      <a:ext cx="5334000" cy="3076513"/>
                     </a:xfrm>
                     <a:prstGeom prst="rect">
                       <a:avLst/>
@@ -3213,7 +3213,7 @@
       <w:r>
         <w:drawing>
           <wp:inline>
-            <wp:extent cx="5334000" cy="2465294"/>
+            <wp:extent cx="5334000" cy="2330823"/>
             <wp:effectExtent b="0" l="0" r="0" t="0"/>
             <wp:docPr descr="A track row’s + (add to playlist), ✎ (rename), and ✕ (delete) controls." title="" id="35" name="Picture"/>
             <a:graphic>
@@ -3234,7 +3234,7 @@
                   <pic:spPr bwMode="auto">
                     <a:xfrm>
                       <a:off x="0" y="0"/>
-                      <a:ext cx="5334000" cy="2465294"/>
+                      <a:ext cx="5334000" cy="2330823"/>
                     </a:xfrm>
                     <a:prstGeom prst="rect">
                       <a:avLst/>
@@ -4090,7 +4090,7 @@
       <w:r>
         <w:drawing>
           <wp:inline>
-            <wp:extent cx="3810000" cy="2540000"/>
+            <wp:extent cx="5334000" cy="2330823"/>
             <wp:effectExtent b="0" l="0" r="0" t="0"/>
             <wp:docPr descr="A playlist group expanded to show its header controls (⟳ Auto-play, ✎ Rename, ✕ Delete) and its songs’ own ▲▼✕+ reorder/remove/add-to-another-playlist controls." title="" id="41" name="Picture"/>
             <a:graphic>
@@ -4111,7 +4111,7 @@
                   <pic:spPr bwMode="auto">
                     <a:xfrm>
                       <a:off x="0" y="0"/>
-                      <a:ext cx="3810000" cy="2540000"/>
+                      <a:ext cx="5334000" cy="2330823"/>
                     </a:xfrm>
                     <a:prstGeom prst="rect">
                       <a:avLst/>
@@ -5279,31 +5279,23 @@
         <w:t xml:space="preserve"> </w:t>
       </w:r>
       <w:r>
-        <w:t xml:space="preserve">button in the toolbar is the app’s normal solid blue. The</w:t>
-      </w:r>
-      <w:r>
-        <w:t xml:space="preserve"> </w:t>
-      </w:r>
-      <w:r>
-        <w:rPr>
-          <w:bCs/>
-          <w:b/>
-        </w:rPr>
-        <w:t xml:space="preserve">transport</w:t>
-      </w:r>
-      <w:r>
-        <w:rPr>
-          <w:bCs/>
-          <w:b/>
-        </w:rPr>
-        <w:t xml:space="preserve"> </w:t>
-      </w:r>
-      <w:r>
-        <w:rPr>
-          <w:bCs/>
-          <w:b/>
-        </w:rPr>
-        <w:t xml:space="preserve">bar</w:t>
+        <w:t xml:space="preserve">button in the toolbar sits at its plain, unlit panel color until you use</w:t>
+      </w:r>
+      <w:r>
+        <w:t xml:space="preserve"> </w:t>
+      </w:r>
+      <w:r>
+        <w:t xml:space="preserve">it. The</w:t>
+      </w:r>
+      <w:r>
+        <w:t xml:space="preserve"> </w:t>
+      </w:r>
+      <w:r>
+        <w:rPr>
+          <w:bCs/>
+          <w:b/>
+        </w:rPr>
+        <w:t xml:space="preserve">transport bar</w:t>
       </w:r>
       <w:r>
         <w:t xml:space="preserve"> </w:t>
@@ -6022,9 +6014,9 @@
       <w:r>
         <w:drawing>
           <wp:inline>
-            <wp:extent cx="5334000" cy="218856"/>
+            <wp:extent cx="5334000" cy="666750"/>
             <wp:effectExtent b="0" l="0" r="0" t="0"/>
-            <wp:docPr descr="The toolbar with Loop active (solid green) next to Zoom to loop, the Zoom slider, Click with its volume slider, and Count-in." title="" id="46" name="Picture"/>
+            <wp:docPr descr="The transport bar and toolbar together, with Loop active (solid green) next to Count-in, BPM, Speed and Tune, and — on the row below — Zoom to loop, the Zoom slider, Click with its own volume slider, and Separate." title="" id="46" name="Picture"/>
             <a:graphic>
               <a:graphicData uri="http://schemas.openxmlformats.org/drawingml/2006/picture">
                 <pic:pic>
@@ -6043,7 +6035,7 @@
                   <pic:spPr bwMode="auto">
                     <a:xfrm>
                       <a:off x="0" y="0"/>
-                      <a:ext cx="5334000" cy="218856"/>
+                      <a:ext cx="5334000" cy="666750"/>
                     </a:xfrm>
                     <a:prstGeom prst="rect">
                       <a:avLst/>
@@ -6067,7 +6059,7 @@
         <w:pStyle w:val="ImageCaption"/>
       </w:pPr>
       <w:r>
-        <w:t xml:space="preserve">The toolbar with Loop active (solid green) next to Zoom to loop, the Zoom slider, Click with its volume slider, and Count-in.</w:t>
+        <w:t xml:space="preserve">The transport bar and toolbar together, with Loop active (solid green) next to Count-in, BPM, Speed and Tune, and — on the row below — Zoom to loop, the Zoom slider, Click with its own volume slider, and Separate.</w:t>
       </w:r>
     </w:p>
     <w:bookmarkEnd w:id="48"/>
@@ -9254,9 +9246,9 @@
       <w:r>
         <w:drawing>
           <wp:inline>
-            <wp:extent cx="3810000" cy="2540000"/>
+            <wp:extent cx="5334000" cy="1090889"/>
             <wp:effectExtent b="0" l="0" r="0" t="0"/>
-            <wp:docPr descr="Tone Lab — Input strip, Rig Presets, and the pedalboard’s first few cards." title="" id="56" name="Picture"/>
+            <wp:docPr descr="Tone Lab’s icon row — Input through Output in signal order, Gate and Graphic EQ lit to show they’re active by default — with the Amp card open below it." title="" id="56" name="Picture"/>
             <a:graphic>
               <a:graphicData uri="http://schemas.openxmlformats.org/drawingml/2006/picture">
                 <pic:pic>
@@ -9275,7 +9267,7 @@
                   <pic:spPr bwMode="auto">
                     <a:xfrm>
                       <a:off x="0" y="0"/>
-                      <a:ext cx="3810000" cy="2540000"/>
+                      <a:ext cx="5334000" cy="1090889"/>
                     </a:xfrm>
                     <a:prstGeom prst="rect">
                       <a:avLst/>
@@ -9299,7 +9291,7 @@
         <w:pStyle w:val="ImageCaption"/>
       </w:pPr>
       <w:r>
-        <w:t xml:space="preserve">Tone Lab — Input strip, Rig Presets, and the pedalboard’s first few cards.</w:t>
+        <w:t xml:space="preserve">Tone Lab’s icon row — Input through Output in signal order, Gate and Graphic EQ lit to show they’re active by default — with the Amp card open below it.</w:t>
       </w:r>
     </w:p>
     <w:bookmarkStart w:id="58" w:name="input"/>
@@ -14256,7 +14248,7 @@
       <w:r>
         <w:drawing>
           <wp:inline>
-            <wp:extent cx="3810000" cy="2540000"/>
+            <wp:extent cx="5334000" cy="3076513"/>
             <wp:effectExtent b="0" l="0" r="0" t="0"/>
             <wp:docPr descr="Play Along — Backing Track, Tuner, Rig Preset, and Riff Capture up top, Record Performance and Takes below." title="" id="71" name="Picture"/>
             <a:graphic>
@@ -14277,7 +14269,7 @@
                   <pic:spPr bwMode="auto">
                     <a:xfrm>
                       <a:off x="0" y="0"/>
-                      <a:ext cx="3810000" cy="2540000"/>
+                      <a:ext cx="5334000" cy="3076513"/>
                     </a:xfrm>
                     <a:prstGeom prst="rect">
                       <a:avLst/>
@@ -17070,7 +17062,7 @@
       <w:r>
         <w:drawing>
           <wp:inline>
-            <wp:extent cx="5334000" cy="1122589"/>
+            <wp:extent cx="5334000" cy="1296080"/>
             <wp:effectExtent b="0" l="0" r="0" t="0"/>
             <wp:docPr descr="The Practice Log card — cumulative total, weighted score, and rated/noted sessions." title="" id="84" name="Picture"/>
             <a:graphic>
@@ -17091,7 +17083,7 @@
                   <pic:spPr bwMode="auto">
                     <a:xfrm>
                       <a:off x="0" y="0"/>
-                      <a:ext cx="5334000" cy="1122589"/>
+                      <a:ext cx="5334000" cy="1296080"/>
                     </a:xfrm>
                     <a:prstGeom prst="rect">
                       <a:avLst/>
@@ -21403,6 +21395,259 @@
       </w:r>
       <w:r>
         <w:t xml:space="preserve">loading a different tab clears any leftover selection automatically.</w:t>
+      </w:r>
+    </w:p>
+    <w:p>
+      <w:pPr>
+        <w:pStyle w:val="BodyText"/>
+      </w:pPr>
+      <w:r>
+        <w:rPr>
+          <w:bCs/>
+          <w:b/>
+        </w:rPr>
+        <w:t xml:space="preserve">Through my rig.</w:t>
+      </w:r>
+      <w:r>
+        <w:t xml:space="preserve"> </w:t>
+      </w:r>
+      <w:r>
+        <w:t xml:space="preserve">Once a tab is loaded, this button next to the Tab</w:t>
+      </w:r>
+      <w:r>
+        <w:t xml:space="preserve"> </w:t>
+      </w:r>
+      <w:r>
+        <w:t xml:space="preserve">Play Bar’s Zoom control swaps its playback from alphaTab’s built-in</w:t>
+      </w:r>
+      <w:r>
+        <w:t xml:space="preserve"> </w:t>
+      </w:r>
+      <w:r>
+        <w:t xml:space="preserve">soundfont over to your Tone Lab rig (amp, cab IR, every pedal) for as</w:t>
+      </w:r>
+      <w:r>
+        <w:t xml:space="preserve"> </w:t>
+      </w:r>
+      <w:r>
+        <w:t xml:space="preserve">long as it’s toggled on — so a Guitar Pro file’s notated guitar part can</w:t>
+      </w:r>
+      <w:r>
+        <w:t xml:space="preserve"> </w:t>
+      </w:r>
+      <w:r>
+        <w:t xml:space="preserve">be previewed through the same tone you’re actually practicing with,</w:t>
+      </w:r>
+      <w:r>
+        <w:t xml:space="preserve"> </w:t>
+      </w:r>
+      <w:r>
+        <w:t xml:space="preserve">instead of a generic synth sound.</w:t>
+      </w:r>
+    </w:p>
+    <w:p>
+      <w:pPr>
+        <w:pStyle w:val="BodyText"/>
+      </w:pPr>
+      <w:r>
+        <w:rPr>
+          <w:bCs/>
+          <w:b/>
+        </w:rPr>
+        <w:t xml:space="preserve">Generate tab from audio.</w:t>
+      </w:r>
+      <w:r>
+        <w:t xml:space="preserve"> </w:t>
+      </w:r>
+      <w:r>
+        <w:t xml:space="preserve">A song loaded in the Mixer can also become</w:t>
+      </w:r>
+      <w:r>
+        <w:t xml:space="preserve"> </w:t>
+      </w:r>
+      <w:r>
+        <w:t xml:space="preserve">a tab of its own, with no Guitar Pro file needed — the panel above the</w:t>
+      </w:r>
+      <w:r>
+        <w:t xml:space="preserve"> </w:t>
+      </w:r>
+      <w:r>
+        <w:t xml:space="preserve">import dropzone picks a</w:t>
+      </w:r>
+      <w:r>
+        <w:t xml:space="preserve"> </w:t>
+      </w:r>
+      <w:r>
+        <w:rPr>
+          <w:bCs/>
+          <w:b/>
+        </w:rPr>
+        <w:t xml:space="preserve">tuning</w:t>
+      </w:r>
+      <w:r>
+        <w:t xml:space="preserve">,</w:t>
+      </w:r>
+      <w:r>
+        <w:t xml:space="preserve"> </w:t>
+      </w:r>
+      <w:r>
+        <w:rPr>
+          <w:bCs/>
+          <w:b/>
+        </w:rPr>
+        <w:t xml:space="preserve">where to start</w:t>
+      </w:r>
+      <w:r>
+        <w:t xml:space="preserve"> </w:t>
+      </w:r>
+      <w:r>
+        <w:t xml:space="preserve">(playhead, the</w:t>
+      </w:r>
+      <w:r>
+        <w:t xml:space="preserve"> </w:t>
+      </w:r>
+      <w:r>
+        <w:t xml:space="preserve">current loop selection, or the very start of the song), and</w:t>
+      </w:r>
+      <w:r>
+        <w:t xml:space="preserve"> </w:t>
+      </w:r>
+      <w:r>
+        <w:rPr>
+          <w:bCs/>
+          <w:b/>
+        </w:rPr>
+        <w:t xml:space="preserve">how much</w:t>
+      </w:r>
+      <w:r>
+        <w:t xml:space="preserve"> </w:t>
+      </w:r>
+      <w:r>
+        <w:t xml:space="preserve">to transcribe (15s/30s/1 minute/to the end), then</w:t>
+      </w:r>
+      <w:r>
+        <w:t xml:space="preserve"> </w:t>
+      </w:r>
+      <w:r>
+        <w:rPr>
+          <w:bCs/>
+          <w:b/>
+        </w:rPr>
+        <w:t xml:space="preserve">Generate tab from</w:t>
+      </w:r>
+      <w:r>
+        <w:rPr>
+          <w:bCs/>
+          <w:b/>
+        </w:rPr>
+        <w:t xml:space="preserve"> </w:t>
+      </w:r>
+      <w:r>
+        <w:rPr>
+          <w:bCs/>
+          <w:b/>
+        </w:rPr>
+        <w:t xml:space="preserve">audio</w:t>
+      </w:r>
+      <w:r>
+        <w:t xml:space="preserve"> </w:t>
+      </w:r>
+      <w:r>
+        <w:t xml:space="preserve">sends that window of the song’s separated</w:t>
+      </w:r>
+      <w:r>
+        <w:t xml:space="preserve"> </w:t>
+      </w:r>
+      <w:r>
+        <w:rPr>
+          <w:rStyle w:val="VerbatimChar"/>
+        </w:rPr>
+        <w:t xml:space="preserve">guitar</w:t>
+      </w:r>
+      <w:r>
+        <w:t xml:space="preserve"> </w:t>
+      </w:r>
+      <w:r>
+        <w:t xml:space="preserve">stem (or</w:t>
+      </w:r>
+      <w:r>
+        <w:t xml:space="preserve"> </w:t>
+      </w:r>
+      <w:r>
+        <w:t xml:space="preserve">whichever stem you’ve marked as the guitar, for an imported stem pack)</w:t>
+      </w:r>
+      <w:r>
+        <w:t xml:space="preserve"> </w:t>
+      </w:r>
+      <w:r>
+        <w:t xml:space="preserve">to the pitch tracker and writes a real</w:t>
+      </w:r>
+      <w:r>
+        <w:t xml:space="preserve"> </w:t>
+      </w:r>
+      <w:r>
+        <w:rPr>
+          <w:rStyle w:val="VerbatimChar"/>
+        </w:rPr>
+        <w:t xml:space="preserve">.gp</w:t>
+      </w:r>
+      <w:r>
+        <w:t xml:space="preserve"> </w:t>
+      </w:r>
+      <w:r>
+        <w:t xml:space="preserve">file straight into this</w:t>
+      </w:r>
+      <w:r>
+        <w:t xml:space="preserve"> </w:t>
+      </w:r>
+      <w:r>
+        <w:t xml:space="preserve">screen’s own library. A line above the button previews exactly what’s</w:t>
+      </w:r>
+      <w:r>
+        <w:t xml:space="preserve"> </w:t>
+      </w:r>
+      <w:r>
+        <w:t xml:space="preserve">about to be transcribed and roughly how long it’ll take before you</w:t>
+      </w:r>
+      <w:r>
+        <w:t xml:space="preserve"> </w:t>
+      </w:r>
+      <w:r>
+        <w:t xml:space="preserve">commit to waiting on it.</w:t>
+      </w:r>
+      <w:r>
+        <w:t xml:space="preserve"> </w:t>
+      </w:r>
+      <w:r>
+        <w:rPr>
+          <w:bCs/>
+          <w:b/>
+        </w:rPr>
+        <w:t xml:space="preserve">Version 1 is lead lines only</w:t>
+      </w:r>
+      <w:r>
+        <w:t xml:space="preserve"> </w:t>
+      </w:r>
+      <w:r>
+        <w:t xml:space="preserve">— the pitch</w:t>
+      </w:r>
+      <w:r>
+        <w:t xml:space="preserve"> </w:t>
+      </w:r>
+      <w:r>
+        <w:t xml:space="preserve">tracker is monophonic, so a section that’s mostly chords/rhythm comes</w:t>
+      </w:r>
+      <w:r>
+        <w:t xml:space="preserve"> </w:t>
+      </w:r>
+      <w:r>
+        <w:t xml:space="preserve">back reporting no confident single-note line rather than a silently</w:t>
+      </w:r>
+      <w:r>
+        <w:t xml:space="preserve"> </w:t>
+      </w:r>
+      <w:r>
+        <w:t xml:space="preserve">empty tab; pick a section with an actual solo or lead line in it.</w:t>
       </w:r>
     </w:p>
     <w:p>

</xml_diff>